<commit_message>
Sviluppo documentazione tecnica, mancano le parti non ancora svolte del codice
</commit_message>
<xml_diff>
--- a/Documentazione_Tecnica.docx
+++ b/Documentazione_Tecnica.docx
@@ -22,14 +22,51 @@
       <w:pPr>
         <w:spacing w:after="100"/>
         <w:jc w:val="center"/>
-      </w:pPr>
-      <w:r>
         <w:rPr>
           <w:color w:val="555555"/>
           <w:sz w:val="28"/>
           <w:szCs w:val="28"/>
         </w:rPr>
-        <w:t>Progetto Java — Gioco Indovina il Personaggio</w:t>
+      </w:pPr>
+      <w:r>
+        <w:rPr>
+          <w:color w:val="555555"/>
+          <w:sz w:val="28"/>
+          <w:szCs w:val="28"/>
+        </w:rPr>
+        <w:t>Indovina chi?</w:t>
+      </w:r>
+    </w:p>
+    <w:p>
+      <w:pPr>
+        <w:spacing w:after="100"/>
+        <w:jc w:val="center"/>
+      </w:pPr>
+      <w:r>
+        <w:rPr>
+          <w:color w:val="555555"/>
+          <w:sz w:val="28"/>
+          <w:szCs w:val="28"/>
+        </w:rPr>
+        <w:t xml:space="preserve">Gallizioli – </w:t>
+      </w:r>
+      <w:proofErr w:type="spellStart"/>
+      <w:r>
+        <w:rPr>
+          <w:color w:val="555555"/>
+          <w:sz w:val="28"/>
+          <w:szCs w:val="28"/>
+        </w:rPr>
+        <w:t>Serughetti</w:t>
+      </w:r>
+      <w:proofErr w:type="spellEnd"/>
+      <w:r>
+        <w:rPr>
+          <w:color w:val="555555"/>
+          <w:sz w:val="28"/>
+          <w:szCs w:val="28"/>
+        </w:rPr>
+        <w:t xml:space="preserve"> – Ferrari - Harid</w:t>
       </w:r>
     </w:p>
     <w:p>
@@ -162,12 +199,6 @@
         <w:gridCol w:w="6160"/>
       </w:tblGrid>
       <w:tr>
-        <w:tblPrEx>
-          <w:tblCellMar>
-            <w:top w:w="0" w:type="dxa"/>
-            <w:bottom w:w="0" w:type="dxa"/>
-          </w:tblCellMar>
-        </w:tblPrEx>
         <w:trPr>
           <w:tblHeader/>
         </w:trPr>
@@ -233,12 +264,6 @@
         </w:tc>
       </w:tr>
       <w:tr>
-        <w:tblPrEx>
-          <w:tblCellMar>
-            <w:top w:w="0" w:type="dxa"/>
-            <w:bottom w:w="0" w:type="dxa"/>
-          </w:tblCellMar>
-        </w:tblPrEx>
         <w:tc>
           <w:tcPr>
             <w:tcW w:w="3200" w:type="dxa"/>
@@ -295,12 +320,6 @@
         </w:tc>
       </w:tr>
       <w:tr>
-        <w:tblPrEx>
-          <w:tblCellMar>
-            <w:top w:w="0" w:type="dxa"/>
-            <w:bottom w:w="0" w:type="dxa"/>
-          </w:tblCellMar>
-        </w:tblPrEx>
         <w:tc>
           <w:tcPr>
             <w:tcW w:w="3200" w:type="dxa"/>
@@ -357,12 +376,6 @@
         </w:tc>
       </w:tr>
       <w:tr>
-        <w:tblPrEx>
-          <w:tblCellMar>
-            <w:top w:w="0" w:type="dxa"/>
-            <w:bottom w:w="0" w:type="dxa"/>
-          </w:tblCellMar>
-        </w:tblPrEx>
         <w:tc>
           <w:tcPr>
             <w:tcW w:w="3200" w:type="dxa"/>
@@ -419,12 +432,6 @@
         </w:tc>
       </w:tr>
       <w:tr>
-        <w:tblPrEx>
-          <w:tblCellMar>
-            <w:top w:w="0" w:type="dxa"/>
-            <w:bottom w:w="0" w:type="dxa"/>
-          </w:tblCellMar>
-        </w:tblPrEx>
         <w:tc>
           <w:tcPr>
             <w:tcW w:w="3200" w:type="dxa"/>
@@ -481,12 +488,6 @@
         </w:tc>
       </w:tr>
       <w:tr>
-        <w:tblPrEx>
-          <w:tblCellMar>
-            <w:top w:w="0" w:type="dxa"/>
-            <w:bottom w:w="0" w:type="dxa"/>
-          </w:tblCellMar>
-        </w:tblPrEx>
         <w:tc>
           <w:tcPr>
             <w:tcW w:w="3200" w:type="dxa"/>
@@ -543,12 +544,6 @@
         </w:tc>
       </w:tr>
       <w:tr>
-        <w:tblPrEx>
-          <w:tblCellMar>
-            <w:top w:w="0" w:type="dxa"/>
-            <w:bottom w:w="0" w:type="dxa"/>
-          </w:tblCellMar>
-        </w:tblPrEx>
         <w:tc>
           <w:tcPr>
             <w:tcW w:w="3200" w:type="dxa"/>
@@ -605,12 +600,6 @@
         </w:tc>
       </w:tr>
       <w:tr>
-        <w:tblPrEx>
-          <w:tblCellMar>
-            <w:top w:w="0" w:type="dxa"/>
-            <w:bottom w:w="0" w:type="dxa"/>
-          </w:tblCellMar>
-        </w:tblPrEx>
         <w:tc>
           <w:tcPr>
             <w:tcW w:w="3200" w:type="dxa"/>
@@ -667,12 +656,6 @@
         </w:tc>
       </w:tr>
       <w:tr>
-        <w:tblPrEx>
-          <w:tblCellMar>
-            <w:top w:w="0" w:type="dxa"/>
-            <w:bottom w:w="0" w:type="dxa"/>
-          </w:tblCellMar>
-        </w:tblPrEx>
         <w:tc>
           <w:tcPr>
             <w:tcW w:w="3200" w:type="dxa"/>
@@ -745,12 +728,6 @@
         </w:tc>
       </w:tr>
       <w:tr>
-        <w:tblPrEx>
-          <w:tblCellMar>
-            <w:top w:w="0" w:type="dxa"/>
-            <w:bottom w:w="0" w:type="dxa"/>
-          </w:tblCellMar>
-        </w:tblPrEx>
         <w:tc>
           <w:tcPr>
             <w:tcW w:w="3200" w:type="dxa"/>
@@ -807,12 +784,6 @@
         </w:tc>
       </w:tr>
       <w:tr>
-        <w:tblPrEx>
-          <w:tblCellMar>
-            <w:top w:w="0" w:type="dxa"/>
-            <w:bottom w:w="0" w:type="dxa"/>
-          </w:tblCellMar>
-        </w:tblPrEx>
         <w:tc>
           <w:tcPr>
             <w:tcW w:w="3200" w:type="dxa"/>
@@ -965,12 +936,6 @@
         <w:gridCol w:w="4000"/>
       </w:tblGrid>
       <w:tr>
-        <w:tblPrEx>
-          <w:tblCellMar>
-            <w:top w:w="0" w:type="dxa"/>
-            <w:bottom w:w="0" w:type="dxa"/>
-          </w:tblCellMar>
-        </w:tblPrEx>
         <w:trPr>
           <w:tblHeader/>
         </w:trPr>
@@ -1066,12 +1031,6 @@
         </w:tc>
       </w:tr>
       <w:tr>
-        <w:tblPrEx>
-          <w:tblCellMar>
-            <w:top w:w="0" w:type="dxa"/>
-            <w:bottom w:w="0" w:type="dxa"/>
-          </w:tblCellMar>
-        </w:tblPrEx>
         <w:tc>
           <w:tcPr>
             <w:tcW w:w="2400" w:type="dxa"/>
@@ -1157,12 +1116,6 @@
         </w:tc>
       </w:tr>
       <w:tr>
-        <w:tblPrEx>
-          <w:tblCellMar>
-            <w:top w:w="0" w:type="dxa"/>
-            <w:bottom w:w="0" w:type="dxa"/>
-          </w:tblCellMar>
-        </w:tblPrEx>
         <w:tc>
           <w:tcPr>
             <w:tcW w:w="2400" w:type="dxa"/>
@@ -1248,12 +1201,6 @@
         </w:tc>
       </w:tr>
       <w:tr>
-        <w:tblPrEx>
-          <w:tblCellMar>
-            <w:top w:w="0" w:type="dxa"/>
-            <w:bottom w:w="0" w:type="dxa"/>
-          </w:tblCellMar>
-        </w:tblPrEx>
         <w:tc>
           <w:tcPr>
             <w:tcW w:w="2400" w:type="dxa"/>
@@ -1353,12 +1300,6 @@
         </w:tc>
       </w:tr>
       <w:tr>
-        <w:tblPrEx>
-          <w:tblCellMar>
-            <w:top w:w="0" w:type="dxa"/>
-            <w:bottom w:w="0" w:type="dxa"/>
-          </w:tblCellMar>
-        </w:tblPrEx>
         <w:tc>
           <w:tcPr>
             <w:tcW w:w="2400" w:type="dxa"/>
@@ -1489,12 +1430,6 @@
         <w:gridCol w:w="4000"/>
       </w:tblGrid>
       <w:tr>
-        <w:tblPrEx>
-          <w:tblCellMar>
-            <w:top w:w="0" w:type="dxa"/>
-            <w:bottom w:w="0" w:type="dxa"/>
-          </w:tblCellMar>
-        </w:tblPrEx>
         <w:trPr>
           <w:tblHeader/>
         </w:trPr>
@@ -1590,12 +1525,6 @@
         </w:tc>
       </w:tr>
       <w:tr>
-        <w:tblPrEx>
-          <w:tblCellMar>
-            <w:top w:w="0" w:type="dxa"/>
-            <w:bottom w:w="0" w:type="dxa"/>
-          </w:tblCellMar>
-        </w:tblPrEx>
         <w:tc>
           <w:tcPr>
             <w:tcW w:w="2400" w:type="dxa"/>
@@ -1688,12 +1617,6 @@
         </w:tc>
       </w:tr>
       <w:tr>
-        <w:tblPrEx>
-          <w:tblCellMar>
-            <w:top w:w="0" w:type="dxa"/>
-            <w:bottom w:w="0" w:type="dxa"/>
-          </w:tblCellMar>
-        </w:tblPrEx>
         <w:tc>
           <w:tcPr>
             <w:tcW w:w="2400" w:type="dxa"/>
@@ -1786,12 +1709,6 @@
         </w:tc>
       </w:tr>
       <w:tr>
-        <w:tblPrEx>
-          <w:tblCellMar>
-            <w:top w:w="0" w:type="dxa"/>
-            <w:bottom w:w="0" w:type="dxa"/>
-          </w:tblCellMar>
-        </w:tblPrEx>
         <w:tc>
           <w:tcPr>
             <w:tcW w:w="2400" w:type="dxa"/>
@@ -1893,12 +1810,6 @@
         </w:tc>
       </w:tr>
       <w:tr>
-        <w:tblPrEx>
-          <w:tblCellMar>
-            <w:top w:w="0" w:type="dxa"/>
-            <w:bottom w:w="0" w:type="dxa"/>
-          </w:tblCellMar>
-        </w:tblPrEx>
         <w:tc>
           <w:tcPr>
             <w:tcW w:w="2400" w:type="dxa"/>
@@ -2000,12 +1911,6 @@
         </w:tc>
       </w:tr>
       <w:tr>
-        <w:tblPrEx>
-          <w:tblCellMar>
-            <w:top w:w="0" w:type="dxa"/>
-            <w:bottom w:w="0" w:type="dxa"/>
-          </w:tblCellMar>
-        </w:tblPrEx>
         <w:tc>
           <w:tcPr>
             <w:tcW w:w="2400" w:type="dxa"/>
@@ -2123,12 +2028,6 @@
         </w:tc>
       </w:tr>
       <w:tr>
-        <w:tblPrEx>
-          <w:tblCellMar>
-            <w:top w:w="0" w:type="dxa"/>
-            <w:bottom w:w="0" w:type="dxa"/>
-          </w:tblCellMar>
-        </w:tblPrEx>
         <w:tc>
           <w:tcPr>
             <w:tcW w:w="2400" w:type="dxa"/>
@@ -2246,12 +2145,6 @@
         </w:tc>
       </w:tr>
       <w:tr>
-        <w:tblPrEx>
-          <w:tblCellMar>
-            <w:top w:w="0" w:type="dxa"/>
-            <w:bottom w:w="0" w:type="dxa"/>
-          </w:tblCellMar>
-        </w:tblPrEx>
         <w:tc>
           <w:tcPr>
             <w:tcW w:w="2400" w:type="dxa"/>
@@ -2466,12 +2359,6 @@
         <w:gridCol w:w="4000"/>
       </w:tblGrid>
       <w:tr>
-        <w:tblPrEx>
-          <w:tblCellMar>
-            <w:top w:w="0" w:type="dxa"/>
-            <w:bottom w:w="0" w:type="dxa"/>
-          </w:tblCellMar>
-        </w:tblPrEx>
         <w:trPr>
           <w:tblHeader/>
         </w:trPr>
@@ -2567,12 +2454,6 @@
         </w:tc>
       </w:tr>
       <w:tr>
-        <w:tblPrEx>
-          <w:tblCellMar>
-            <w:top w:w="0" w:type="dxa"/>
-            <w:bottom w:w="0" w:type="dxa"/>
-          </w:tblCellMar>
-        </w:tblPrEx>
         <w:tc>
           <w:tcPr>
             <w:tcW w:w="2400" w:type="dxa"/>
@@ -2687,12 +2568,6 @@
         <w:gridCol w:w="3991"/>
       </w:tblGrid>
       <w:tr>
-        <w:tblPrEx>
-          <w:tblCellMar>
-            <w:top w:w="0" w:type="dxa"/>
-            <w:bottom w:w="0" w:type="dxa"/>
-          </w:tblCellMar>
-        </w:tblPrEx>
         <w:trPr>
           <w:tblHeader/>
         </w:trPr>
@@ -2788,12 +2663,6 @@
         </w:tc>
       </w:tr>
       <w:tr>
-        <w:tblPrEx>
-          <w:tblCellMar>
-            <w:top w:w="0" w:type="dxa"/>
-            <w:bottom w:w="0" w:type="dxa"/>
-          </w:tblCellMar>
-        </w:tblPrEx>
         <w:tc>
           <w:tcPr>
             <w:tcW w:w="2400" w:type="dxa"/>
@@ -2895,12 +2764,6 @@
         </w:tc>
       </w:tr>
       <w:tr>
-        <w:tblPrEx>
-          <w:tblCellMar>
-            <w:top w:w="0" w:type="dxa"/>
-            <w:bottom w:w="0" w:type="dxa"/>
-          </w:tblCellMar>
-        </w:tblPrEx>
         <w:tc>
           <w:tcPr>
             <w:tcW w:w="2400" w:type="dxa"/>
@@ -3020,12 +2883,6 @@
         </w:tc>
       </w:tr>
       <w:tr>
-        <w:tblPrEx>
-          <w:tblCellMar>
-            <w:top w:w="0" w:type="dxa"/>
-            <w:bottom w:w="0" w:type="dxa"/>
-          </w:tblCellMar>
-        </w:tblPrEx>
         <w:tc>
           <w:tcPr>
             <w:tcW w:w="2400" w:type="dxa"/>
@@ -3136,12 +2993,6 @@
         </w:tc>
       </w:tr>
       <w:tr>
-        <w:tblPrEx>
-          <w:tblCellMar>
-            <w:top w:w="0" w:type="dxa"/>
-            <w:bottom w:w="0" w:type="dxa"/>
-          </w:tblCellMar>
-        </w:tblPrEx>
         <w:tc>
           <w:tcPr>
             <w:tcW w:w="2400" w:type="dxa"/>
@@ -3413,12 +3264,6 @@
         <w:gridCol w:w="4000"/>
       </w:tblGrid>
       <w:tr>
-        <w:tblPrEx>
-          <w:tblCellMar>
-            <w:top w:w="0" w:type="dxa"/>
-            <w:bottom w:w="0" w:type="dxa"/>
-          </w:tblCellMar>
-        </w:tblPrEx>
         <w:trPr>
           <w:tblHeader/>
         </w:trPr>
@@ -3514,12 +3359,6 @@
         </w:tc>
       </w:tr>
       <w:tr>
-        <w:tblPrEx>
-          <w:tblCellMar>
-            <w:top w:w="0" w:type="dxa"/>
-            <w:bottom w:w="0" w:type="dxa"/>
-          </w:tblCellMar>
-        </w:tblPrEx>
         <w:tc>
           <w:tcPr>
             <w:tcW w:w="2400" w:type="dxa"/>
@@ -3603,12 +3442,6 @@
         </w:tc>
       </w:tr>
       <w:tr>
-        <w:tblPrEx>
-          <w:tblCellMar>
-            <w:top w:w="0" w:type="dxa"/>
-            <w:bottom w:w="0" w:type="dxa"/>
-          </w:tblCellMar>
-        </w:tblPrEx>
         <w:tc>
           <w:tcPr>
             <w:tcW w:w="2400" w:type="dxa"/>
@@ -3692,12 +3525,6 @@
         </w:tc>
       </w:tr>
       <w:tr>
-        <w:tblPrEx>
-          <w:tblCellMar>
-            <w:top w:w="0" w:type="dxa"/>
-            <w:bottom w:w="0" w:type="dxa"/>
-          </w:tblCellMar>
-        </w:tblPrEx>
         <w:tc>
           <w:tcPr>
             <w:tcW w:w="2400" w:type="dxa"/>
@@ -3812,12 +3639,6 @@
         <w:gridCol w:w="4000"/>
       </w:tblGrid>
       <w:tr>
-        <w:tblPrEx>
-          <w:tblCellMar>
-            <w:top w:w="0" w:type="dxa"/>
-            <w:bottom w:w="0" w:type="dxa"/>
-          </w:tblCellMar>
-        </w:tblPrEx>
         <w:trPr>
           <w:tblHeader/>
         </w:trPr>
@@ -3913,12 +3734,6 @@
         </w:tc>
       </w:tr>
       <w:tr>
-        <w:tblPrEx>
-          <w:tblCellMar>
-            <w:top w:w="0" w:type="dxa"/>
-            <w:bottom w:w="0" w:type="dxa"/>
-          </w:tblCellMar>
-        </w:tblPrEx>
         <w:tc>
           <w:tcPr>
             <w:tcW w:w="2400" w:type="dxa"/>
@@ -4011,12 +3826,6 @@
         </w:tc>
       </w:tr>
       <w:tr>
-        <w:tblPrEx>
-          <w:tblCellMar>
-            <w:top w:w="0" w:type="dxa"/>
-            <w:bottom w:w="0" w:type="dxa"/>
-          </w:tblCellMar>
-        </w:tblPrEx>
         <w:tc>
           <w:tcPr>
             <w:tcW w:w="2400" w:type="dxa"/>
@@ -4118,12 +3927,6 @@
         </w:tc>
       </w:tr>
       <w:tr>
-        <w:tblPrEx>
-          <w:tblCellMar>
-            <w:top w:w="0" w:type="dxa"/>
-            <w:bottom w:w="0" w:type="dxa"/>
-          </w:tblCellMar>
-        </w:tblPrEx>
         <w:tc>
           <w:tcPr>
             <w:tcW w:w="2400" w:type="dxa"/>
@@ -4355,12 +4158,6 @@
         <w:gridCol w:w="4000"/>
       </w:tblGrid>
       <w:tr>
-        <w:tblPrEx>
-          <w:tblCellMar>
-            <w:top w:w="0" w:type="dxa"/>
-            <w:bottom w:w="0" w:type="dxa"/>
-          </w:tblCellMar>
-        </w:tblPrEx>
         <w:trPr>
           <w:tblHeader/>
         </w:trPr>
@@ -4456,12 +4253,6 @@
         </w:tc>
       </w:tr>
       <w:tr>
-        <w:tblPrEx>
-          <w:tblCellMar>
-            <w:top w:w="0" w:type="dxa"/>
-            <w:bottom w:w="0" w:type="dxa"/>
-          </w:tblCellMar>
-        </w:tblPrEx>
         <w:tc>
           <w:tcPr>
             <w:tcW w:w="2400" w:type="dxa"/>
@@ -4545,12 +4336,6 @@
         </w:tc>
       </w:tr>
       <w:tr>
-        <w:tblPrEx>
-          <w:tblCellMar>
-            <w:top w:w="0" w:type="dxa"/>
-            <w:bottom w:w="0" w:type="dxa"/>
-          </w:tblCellMar>
-        </w:tblPrEx>
         <w:tc>
           <w:tcPr>
             <w:tcW w:w="2400" w:type="dxa"/>
@@ -4634,12 +4419,6 @@
         </w:tc>
       </w:tr>
       <w:tr>
-        <w:tblPrEx>
-          <w:tblCellMar>
-            <w:top w:w="0" w:type="dxa"/>
-            <w:bottom w:w="0" w:type="dxa"/>
-          </w:tblCellMar>
-        </w:tblPrEx>
         <w:tc>
           <w:tcPr>
             <w:tcW w:w="2400" w:type="dxa"/>
@@ -4763,12 +4542,6 @@
         <w:gridCol w:w="3963"/>
       </w:tblGrid>
       <w:tr>
-        <w:tblPrEx>
-          <w:tblCellMar>
-            <w:top w:w="0" w:type="dxa"/>
-            <w:bottom w:w="0" w:type="dxa"/>
-          </w:tblCellMar>
-        </w:tblPrEx>
         <w:trPr>
           <w:tblHeader/>
         </w:trPr>
@@ -4865,12 +4638,6 @@
         </w:tc>
       </w:tr>
       <w:tr>
-        <w:tblPrEx>
-          <w:tblCellMar>
-            <w:top w:w="0" w:type="dxa"/>
-            <w:bottom w:w="0" w:type="dxa"/>
-          </w:tblCellMar>
-        </w:tblPrEx>
         <w:tc>
           <w:tcPr>
             <w:tcW w:w="2400" w:type="dxa"/>
@@ -4979,12 +4746,6 @@
         </w:tc>
       </w:tr>
       <w:tr>
-        <w:tblPrEx>
-          <w:tblCellMar>
-            <w:top w:w="0" w:type="dxa"/>
-            <w:bottom w:w="0" w:type="dxa"/>
-          </w:tblCellMar>
-        </w:tblPrEx>
         <w:tc>
           <w:tcPr>
             <w:tcW w:w="2400" w:type="dxa"/>
@@ -5104,12 +4865,6 @@
         </w:tc>
       </w:tr>
       <w:tr>
-        <w:tblPrEx>
-          <w:tblCellMar>
-            <w:top w:w="0" w:type="dxa"/>
-            <w:bottom w:w="0" w:type="dxa"/>
-          </w:tblCellMar>
-        </w:tblPrEx>
         <w:tc>
           <w:tcPr>
             <w:tcW w:w="2400" w:type="dxa"/>
@@ -5489,12 +5244,6 @@
         <w:gridCol w:w="4000"/>
       </w:tblGrid>
       <w:tr>
-        <w:tblPrEx>
-          <w:tblCellMar>
-            <w:top w:w="0" w:type="dxa"/>
-            <w:bottom w:w="0" w:type="dxa"/>
-          </w:tblCellMar>
-        </w:tblPrEx>
         <w:trPr>
           <w:tblHeader/>
         </w:trPr>
@@ -5590,12 +5339,6 @@
         </w:tc>
       </w:tr>
       <w:tr>
-        <w:tblPrEx>
-          <w:tblCellMar>
-            <w:top w:w="0" w:type="dxa"/>
-            <w:bottom w:w="0" w:type="dxa"/>
-          </w:tblCellMar>
-        </w:tblPrEx>
         <w:tc>
           <w:tcPr>
             <w:tcW w:w="2400" w:type="dxa"/>
@@ -5690,12 +5433,6 @@
         </w:tc>
       </w:tr>
       <w:tr>
-        <w:tblPrEx>
-          <w:tblCellMar>
-            <w:top w:w="0" w:type="dxa"/>
-            <w:bottom w:w="0" w:type="dxa"/>
-          </w:tblCellMar>
-        </w:tblPrEx>
         <w:tc>
           <w:tcPr>
             <w:tcW w:w="2400" w:type="dxa"/>
@@ -5790,12 +5527,6 @@
         </w:tc>
       </w:tr>
       <w:tr>
-        <w:tblPrEx>
-          <w:tblCellMar>
-            <w:top w:w="0" w:type="dxa"/>
-            <w:bottom w:w="0" w:type="dxa"/>
-          </w:tblCellMar>
-        </w:tblPrEx>
         <w:tc>
           <w:tcPr>
             <w:tcW w:w="2400" w:type="dxa"/>
@@ -5881,12 +5612,6 @@
         </w:tc>
       </w:tr>
       <w:tr>
-        <w:tblPrEx>
-          <w:tblCellMar>
-            <w:top w:w="0" w:type="dxa"/>
-            <w:bottom w:w="0" w:type="dxa"/>
-          </w:tblCellMar>
-        </w:tblPrEx>
         <w:tc>
           <w:tcPr>
             <w:tcW w:w="2400" w:type="dxa"/>
@@ -5972,12 +5697,6 @@
         </w:tc>
       </w:tr>
       <w:tr>
-        <w:tblPrEx>
-          <w:tblCellMar>
-            <w:top w:w="0" w:type="dxa"/>
-            <w:bottom w:w="0" w:type="dxa"/>
-          </w:tblCellMar>
-        </w:tblPrEx>
         <w:tc>
           <w:tcPr>
             <w:tcW w:w="2400" w:type="dxa"/>
@@ -6065,12 +5784,6 @@
         </w:tc>
       </w:tr>
       <w:tr>
-        <w:tblPrEx>
-          <w:tblCellMar>
-            <w:top w:w="0" w:type="dxa"/>
-            <w:bottom w:w="0" w:type="dxa"/>
-          </w:tblCellMar>
-        </w:tblPrEx>
         <w:tc>
           <w:tcPr>
             <w:tcW w:w="2400" w:type="dxa"/>
@@ -6158,12 +5871,6 @@
         </w:tc>
       </w:tr>
       <w:tr>
-        <w:tblPrEx>
-          <w:tblCellMar>
-            <w:top w:w="0" w:type="dxa"/>
-            <w:bottom w:w="0" w:type="dxa"/>
-          </w:tblCellMar>
-        </w:tblPrEx>
         <w:tc>
           <w:tcPr>
             <w:tcW w:w="2400" w:type="dxa"/>
@@ -6327,12 +6034,6 @@
         <w:gridCol w:w="4000"/>
       </w:tblGrid>
       <w:tr>
-        <w:tblPrEx>
-          <w:tblCellMar>
-            <w:top w:w="0" w:type="dxa"/>
-            <w:bottom w:w="0" w:type="dxa"/>
-          </w:tblCellMar>
-        </w:tblPrEx>
         <w:trPr>
           <w:tblHeader/>
         </w:trPr>
@@ -6429,12 +6130,6 @@
         </w:tc>
       </w:tr>
       <w:tr>
-        <w:tblPrEx>
-          <w:tblCellMar>
-            <w:top w:w="0" w:type="dxa"/>
-            <w:bottom w:w="0" w:type="dxa"/>
-          </w:tblCellMar>
-        </w:tblPrEx>
         <w:tc>
           <w:tcPr>
             <w:tcW w:w="2400" w:type="dxa"/>
@@ -6561,12 +6256,6 @@
         </w:tc>
       </w:tr>
       <w:tr>
-        <w:tblPrEx>
-          <w:tblCellMar>
-            <w:top w:w="0" w:type="dxa"/>
-            <w:bottom w:w="0" w:type="dxa"/>
-          </w:tblCellMar>
-        </w:tblPrEx>
         <w:tc>
           <w:tcPr>
             <w:tcW w:w="2400" w:type="dxa"/>
@@ -6875,12 +6564,6 @@
         <w:gridCol w:w="4000"/>
       </w:tblGrid>
       <w:tr>
-        <w:tblPrEx>
-          <w:tblCellMar>
-            <w:top w:w="0" w:type="dxa"/>
-            <w:bottom w:w="0" w:type="dxa"/>
-          </w:tblCellMar>
-        </w:tblPrEx>
         <w:trPr>
           <w:tblHeader/>
         </w:trPr>
@@ -6976,12 +6659,6 @@
         </w:tc>
       </w:tr>
       <w:tr>
-        <w:tblPrEx>
-          <w:tblCellMar>
-            <w:top w:w="0" w:type="dxa"/>
-            <w:bottom w:w="0" w:type="dxa"/>
-          </w:tblCellMar>
-        </w:tblPrEx>
         <w:tc>
           <w:tcPr>
             <w:tcW w:w="2400" w:type="dxa"/>
@@ -7108,12 +6785,6 @@
         </w:tc>
       </w:tr>
       <w:tr>
-        <w:tblPrEx>
-          <w:tblCellMar>
-            <w:top w:w="0" w:type="dxa"/>
-            <w:bottom w:w="0" w:type="dxa"/>
-          </w:tblCellMar>
-        </w:tblPrEx>
         <w:tc>
           <w:tcPr>
             <w:tcW w:w="2400" w:type="dxa"/>
@@ -7258,12 +6929,6 @@
         </w:tc>
       </w:tr>
       <w:tr>
-        <w:tblPrEx>
-          <w:tblCellMar>
-            <w:top w:w="0" w:type="dxa"/>
-            <w:bottom w:w="0" w:type="dxa"/>
-          </w:tblCellMar>
-        </w:tblPrEx>
         <w:tc>
           <w:tcPr>
             <w:tcW w:w="2400" w:type="dxa"/>
@@ -7390,12 +7055,6 @@
         </w:tc>
       </w:tr>
       <w:tr>
-        <w:tblPrEx>
-          <w:tblCellMar>
-            <w:top w:w="0" w:type="dxa"/>
-            <w:bottom w:w="0" w:type="dxa"/>
-          </w:tblCellMar>
-        </w:tblPrEx>
         <w:tc>
           <w:tcPr>
             <w:tcW w:w="2400" w:type="dxa"/>
@@ -7558,25 +7217,6 @@
       <w:pPr>
         <w:spacing w:after="80"/>
       </w:pPr>
-    </w:p>
-    <w:p>
-      <w:pPr>
-        <w:pStyle w:val="Titolo1"/>
-        <w:pBdr>
-          <w:bottom w:val="single" w:sz="6" w:space="4" w:color="1F4E79"/>
-        </w:pBdr>
-      </w:pPr>
-      <w:r>
-        <w:t>4. Riepilogo Bug e Parti Incomplete</w:t>
-      </w:r>
-    </w:p>
-    <w:p>
-      <w:pPr>
-        <w:spacing w:after="120"/>
-      </w:pPr>
-      <w:r>
-        <w:t>La tabella seguente riassume tutti i problemi rilevati nell'analisi statica del codice sorgente.</w:t>
-      </w:r>
     </w:p>
     <w:tbl>
       <w:tblPr>
@@ -7601,15 +7241,6 @@
         <w:gridCol w:w="5160"/>
       </w:tblGrid>
       <w:tr>
-        <w:tblPrEx>
-          <w:tblCellMar>
-            <w:top w:w="0" w:type="dxa"/>
-            <w:bottom w:w="0" w:type="dxa"/>
-          </w:tblCellMar>
-        </w:tblPrEx>
-        <w:trPr>
-          <w:tblHeader/>
-        </w:trPr>
         <w:tc>
           <w:tcPr>
             <w:tcW w:w="2400" w:type="dxa"/>
@@ -7619,211 +7250,6 @@
               <w:bottom w:val="single" w:sz="1" w:space="0" w:color="CCCCCC"/>
               <w:right w:val="single" w:sz="1" w:space="0" w:color="CCCCCC"/>
             </w:tcBorders>
-            <w:shd w:val="clear" w:color="auto" w:fill="1F4E79"/>
-            <w:tcMar>
-              <w:top w:w="80" w:type="dxa"/>
-              <w:left w:w="140" w:type="dxa"/>
-              <w:bottom w:w="80" w:type="dxa"/>
-              <w:right w:w="140" w:type="dxa"/>
-            </w:tcMar>
-          </w:tcPr>
-          <w:p>
-            <w:r>
-              <w:rPr>
-                <w:b/>
-                <w:bCs/>
-                <w:color w:val="FFFFFF"/>
-                <w:sz w:val="18"/>
-                <w:szCs w:val="18"/>
-              </w:rPr>
-              <w:t>File</w:t>
-            </w:r>
-          </w:p>
-        </w:tc>
-        <w:tc>
-          <w:tcPr>
-            <w:tcW w:w="1800" w:type="dxa"/>
-            <w:tcBorders>
-              <w:top w:val="single" w:sz="1" w:space="0" w:color="CCCCCC"/>
-              <w:left w:val="single" w:sz="1" w:space="0" w:color="CCCCCC"/>
-              <w:bottom w:val="single" w:sz="1" w:space="0" w:color="CCCCCC"/>
-              <w:right w:val="single" w:sz="1" w:space="0" w:color="CCCCCC"/>
-            </w:tcBorders>
-            <w:shd w:val="clear" w:color="auto" w:fill="1F4E79"/>
-            <w:tcMar>
-              <w:top w:w="80" w:type="dxa"/>
-              <w:left w:w="140" w:type="dxa"/>
-              <w:bottom w:w="80" w:type="dxa"/>
-              <w:right w:w="140" w:type="dxa"/>
-            </w:tcMar>
-          </w:tcPr>
-          <w:p>
-            <w:r>
-              <w:rPr>
-                <w:b/>
-                <w:bCs/>
-                <w:color w:val="FFFFFF"/>
-                <w:sz w:val="18"/>
-                <w:szCs w:val="18"/>
-              </w:rPr>
-              <w:t>Priorità</w:t>
-            </w:r>
-          </w:p>
-        </w:tc>
-        <w:tc>
-          <w:tcPr>
-            <w:tcW w:w="5160" w:type="dxa"/>
-            <w:tcBorders>
-              <w:top w:val="single" w:sz="1" w:space="0" w:color="CCCCCC"/>
-              <w:left w:val="single" w:sz="1" w:space="0" w:color="CCCCCC"/>
-              <w:bottom w:val="single" w:sz="1" w:space="0" w:color="CCCCCC"/>
-              <w:right w:val="single" w:sz="1" w:space="0" w:color="CCCCCC"/>
-            </w:tcBorders>
-            <w:shd w:val="clear" w:color="auto" w:fill="1F4E79"/>
-            <w:tcMar>
-              <w:top w:w="80" w:type="dxa"/>
-              <w:left w:w="140" w:type="dxa"/>
-              <w:bottom w:w="80" w:type="dxa"/>
-              <w:right w:w="140" w:type="dxa"/>
-            </w:tcMar>
-          </w:tcPr>
-          <w:p>
-            <w:r>
-              <w:rPr>
-                <w:b/>
-                <w:bCs/>
-                <w:color w:val="FFFFFF"/>
-                <w:sz w:val="18"/>
-                <w:szCs w:val="18"/>
-              </w:rPr>
-              <w:t>Descrizione</w:t>
-            </w:r>
-          </w:p>
-        </w:tc>
-      </w:tr>
-      <w:tr>
-        <w:tblPrEx>
-          <w:tblCellMar>
-            <w:top w:w="0" w:type="dxa"/>
-            <w:bottom w:w="0" w:type="dxa"/>
-          </w:tblCellMar>
-        </w:tblPrEx>
-        <w:tc>
-          <w:tcPr>
-            <w:tcW w:w="2400" w:type="dxa"/>
-            <w:tcBorders>
-              <w:top w:val="single" w:sz="1" w:space="0" w:color="CCCCCC"/>
-              <w:left w:val="single" w:sz="1" w:space="0" w:color="CCCCCC"/>
-              <w:bottom w:val="single" w:sz="1" w:space="0" w:color="CCCCCC"/>
-              <w:right w:val="single" w:sz="1" w:space="0" w:color="CCCCCC"/>
-            </w:tcBorders>
-            <w:shd w:val="clear" w:color="auto" w:fill="EAF2FB"/>
-            <w:tcMar>
-              <w:top w:w="80" w:type="dxa"/>
-              <w:left w:w="140" w:type="dxa"/>
-              <w:bottom w:w="80" w:type="dxa"/>
-              <w:right w:w="140" w:type="dxa"/>
-            </w:tcMar>
-          </w:tcPr>
-          <w:p>
-            <w:r>
-              <w:rPr>
-                <w:sz w:val="18"/>
-                <w:szCs w:val="18"/>
-              </w:rPr>
-              <w:t>Albero.java</w:t>
-            </w:r>
-          </w:p>
-        </w:tc>
-        <w:tc>
-          <w:tcPr>
-            <w:tcW w:w="1800" w:type="dxa"/>
-            <w:tcBorders>
-              <w:top w:val="single" w:sz="1" w:space="0" w:color="CCCCCC"/>
-              <w:left w:val="single" w:sz="1" w:space="0" w:color="CCCCCC"/>
-              <w:bottom w:val="single" w:sz="1" w:space="0" w:color="CCCCCC"/>
-              <w:right w:val="single" w:sz="1" w:space="0" w:color="CCCCCC"/>
-            </w:tcBorders>
-            <w:shd w:val="clear" w:color="auto" w:fill="EAF2FB"/>
-            <w:tcMar>
-              <w:top w:w="80" w:type="dxa"/>
-              <w:left w:w="140" w:type="dxa"/>
-              <w:bottom w:w="80" w:type="dxa"/>
-              <w:right w:w="140" w:type="dxa"/>
-            </w:tcMar>
-          </w:tcPr>
-          <w:p>
-            <w:r>
-              <w:rPr>
-                <w:sz w:val="18"/>
-                <w:szCs w:val="18"/>
-              </w:rPr>
-              <w:t>Critico</w:t>
-            </w:r>
-          </w:p>
-        </w:tc>
-        <w:tc>
-          <w:tcPr>
-            <w:tcW w:w="5160" w:type="dxa"/>
-            <w:tcBorders>
-              <w:top w:val="single" w:sz="1" w:space="0" w:color="CCCCCC"/>
-              <w:left w:val="single" w:sz="1" w:space="0" w:color="CCCCCC"/>
-              <w:bottom w:val="single" w:sz="1" w:space="0" w:color="CCCCCC"/>
-              <w:right w:val="single" w:sz="1" w:space="0" w:color="CCCCCC"/>
-            </w:tcBorders>
-            <w:shd w:val="clear" w:color="auto" w:fill="EAF2FB"/>
-            <w:tcMar>
-              <w:top w:w="80" w:type="dxa"/>
-              <w:left w:w="140" w:type="dxa"/>
-              <w:bottom w:w="80" w:type="dxa"/>
-              <w:right w:w="140" w:type="dxa"/>
-            </w:tcMar>
-          </w:tcPr>
-          <w:p>
-            <w:proofErr w:type="spellStart"/>
-            <w:proofErr w:type="gramStart"/>
-            <w:r>
-              <w:rPr>
-                <w:sz w:val="18"/>
-                <w:szCs w:val="18"/>
-              </w:rPr>
-              <w:t>getNodo</w:t>
-            </w:r>
-            <w:proofErr w:type="spellEnd"/>
-            <w:r>
-              <w:rPr>
-                <w:sz w:val="18"/>
-                <w:szCs w:val="18"/>
-              </w:rPr>
-              <w:t>(</w:t>
-            </w:r>
-            <w:proofErr w:type="gramEnd"/>
-            <w:r>
-              <w:rPr>
-                <w:sz w:val="18"/>
-                <w:szCs w:val="18"/>
-              </w:rPr>
-              <w:t>): confronto stringhe con == e risultato ricorsivo non catturato — la ricerca non funziona mai</w:t>
-            </w:r>
-          </w:p>
-        </w:tc>
-      </w:tr>
-      <w:tr>
-        <w:tblPrEx>
-          <w:tblCellMar>
-            <w:top w:w="0" w:type="dxa"/>
-            <w:bottom w:w="0" w:type="dxa"/>
-          </w:tblCellMar>
-        </w:tblPrEx>
-        <w:tc>
-          <w:tcPr>
-            <w:tcW w:w="2400" w:type="dxa"/>
-            <w:tcBorders>
-              <w:top w:val="single" w:sz="1" w:space="0" w:color="CCCCCC"/>
-              <w:left w:val="single" w:sz="1" w:space="0" w:color="CCCCCC"/>
-              <w:bottom w:val="single" w:sz="1" w:space="0" w:color="CCCCCC"/>
-              <w:right w:val="single" w:sz="1" w:space="0" w:color="CCCCCC"/>
-            </w:tcBorders>
             <w:shd w:val="clear" w:color="auto" w:fill="FFFFFF"/>
             <w:tcMar>
               <w:top w:w="80" w:type="dxa"/>
@@ -7838,895 +7264,6 @@
                 <w:sz w:val="18"/>
                 <w:szCs w:val="18"/>
               </w:rPr>
-              <w:t>Albero.java</w:t>
-            </w:r>
-          </w:p>
-        </w:tc>
-        <w:tc>
-          <w:tcPr>
-            <w:tcW w:w="1800" w:type="dxa"/>
-            <w:tcBorders>
-              <w:top w:val="single" w:sz="1" w:space="0" w:color="CCCCCC"/>
-              <w:left w:val="single" w:sz="1" w:space="0" w:color="CCCCCC"/>
-              <w:bottom w:val="single" w:sz="1" w:space="0" w:color="CCCCCC"/>
-              <w:right w:val="single" w:sz="1" w:space="0" w:color="CCCCCC"/>
-            </w:tcBorders>
-            <w:shd w:val="clear" w:color="auto" w:fill="FFFFFF"/>
-            <w:tcMar>
-              <w:top w:w="80" w:type="dxa"/>
-              <w:left w:w="140" w:type="dxa"/>
-              <w:bottom w:w="80" w:type="dxa"/>
-              <w:right w:w="140" w:type="dxa"/>
-            </w:tcMar>
-          </w:tcPr>
-          <w:p>
-            <w:r>
-              <w:rPr>
-                <w:sz w:val="18"/>
-                <w:szCs w:val="18"/>
-              </w:rPr>
-              <w:t>Critico</w:t>
-            </w:r>
-          </w:p>
-        </w:tc>
-        <w:tc>
-          <w:tcPr>
-            <w:tcW w:w="5160" w:type="dxa"/>
-            <w:tcBorders>
-              <w:top w:val="single" w:sz="1" w:space="0" w:color="CCCCCC"/>
-              <w:left w:val="single" w:sz="1" w:space="0" w:color="CCCCCC"/>
-              <w:bottom w:val="single" w:sz="1" w:space="0" w:color="CCCCCC"/>
-              <w:right w:val="single" w:sz="1" w:space="0" w:color="CCCCCC"/>
-            </w:tcBorders>
-            <w:shd w:val="clear" w:color="auto" w:fill="FFFFFF"/>
-            <w:tcMar>
-              <w:top w:w="80" w:type="dxa"/>
-              <w:left w:w="140" w:type="dxa"/>
-              <w:bottom w:w="80" w:type="dxa"/>
-              <w:right w:w="140" w:type="dxa"/>
-            </w:tcMar>
-          </w:tcPr>
-          <w:p>
-            <w:proofErr w:type="spellStart"/>
-            <w:proofErr w:type="gramStart"/>
-            <w:r>
-              <w:rPr>
-                <w:sz w:val="18"/>
-                <w:szCs w:val="18"/>
-              </w:rPr>
-              <w:t>AggiungiNodo</w:t>
-            </w:r>
-            <w:proofErr w:type="spellEnd"/>
-            <w:r>
-              <w:rPr>
-                <w:sz w:val="18"/>
-                <w:szCs w:val="18"/>
-              </w:rPr>
-              <w:t>(</w:t>
-            </w:r>
-            <w:proofErr w:type="gramEnd"/>
-            <w:r>
-              <w:rPr>
-                <w:sz w:val="18"/>
-                <w:szCs w:val="18"/>
-              </w:rPr>
-              <w:t>): variabile locale riassegnata senza aggiornare l'albero</w:t>
-            </w:r>
-          </w:p>
-        </w:tc>
-      </w:tr>
-      <w:tr>
-        <w:tblPrEx>
-          <w:tblCellMar>
-            <w:top w:w="0" w:type="dxa"/>
-            <w:bottom w:w="0" w:type="dxa"/>
-          </w:tblCellMar>
-        </w:tblPrEx>
-        <w:tc>
-          <w:tcPr>
-            <w:tcW w:w="2400" w:type="dxa"/>
-            <w:tcBorders>
-              <w:top w:val="single" w:sz="1" w:space="0" w:color="CCCCCC"/>
-              <w:left w:val="single" w:sz="1" w:space="0" w:color="CCCCCC"/>
-              <w:bottom w:val="single" w:sz="1" w:space="0" w:color="CCCCCC"/>
-              <w:right w:val="single" w:sz="1" w:space="0" w:color="CCCCCC"/>
-            </w:tcBorders>
-            <w:shd w:val="clear" w:color="auto" w:fill="EAF2FB"/>
-            <w:tcMar>
-              <w:top w:w="80" w:type="dxa"/>
-              <w:left w:w="140" w:type="dxa"/>
-              <w:bottom w:w="80" w:type="dxa"/>
-              <w:right w:w="140" w:type="dxa"/>
-            </w:tcMar>
-          </w:tcPr>
-          <w:p>
-            <w:r>
-              <w:rPr>
-                <w:sz w:val="18"/>
-                <w:szCs w:val="18"/>
-              </w:rPr>
-              <w:t>Giocatore.java</w:t>
-            </w:r>
-          </w:p>
-        </w:tc>
-        <w:tc>
-          <w:tcPr>
-            <w:tcW w:w="1800" w:type="dxa"/>
-            <w:tcBorders>
-              <w:top w:val="single" w:sz="1" w:space="0" w:color="CCCCCC"/>
-              <w:left w:val="single" w:sz="1" w:space="0" w:color="CCCCCC"/>
-              <w:bottom w:val="single" w:sz="1" w:space="0" w:color="CCCCCC"/>
-              <w:right w:val="single" w:sz="1" w:space="0" w:color="CCCCCC"/>
-            </w:tcBorders>
-            <w:shd w:val="clear" w:color="auto" w:fill="EAF2FB"/>
-            <w:tcMar>
-              <w:top w:w="80" w:type="dxa"/>
-              <w:left w:w="140" w:type="dxa"/>
-              <w:bottom w:w="80" w:type="dxa"/>
-              <w:right w:w="140" w:type="dxa"/>
-            </w:tcMar>
-          </w:tcPr>
-          <w:p>
-            <w:r>
-              <w:rPr>
-                <w:sz w:val="18"/>
-                <w:szCs w:val="18"/>
-              </w:rPr>
-              <w:t>Alto</w:t>
-            </w:r>
-          </w:p>
-        </w:tc>
-        <w:tc>
-          <w:tcPr>
-            <w:tcW w:w="5160" w:type="dxa"/>
-            <w:tcBorders>
-              <w:top w:val="single" w:sz="1" w:space="0" w:color="CCCCCC"/>
-              <w:left w:val="single" w:sz="1" w:space="0" w:color="CCCCCC"/>
-              <w:bottom w:val="single" w:sz="1" w:space="0" w:color="CCCCCC"/>
-              <w:right w:val="single" w:sz="1" w:space="0" w:color="CCCCCC"/>
-            </w:tcBorders>
-            <w:shd w:val="clear" w:color="auto" w:fill="EAF2FB"/>
-            <w:tcMar>
-              <w:top w:w="80" w:type="dxa"/>
-              <w:left w:w="140" w:type="dxa"/>
-              <w:bottom w:w="80" w:type="dxa"/>
-              <w:right w:w="140" w:type="dxa"/>
-            </w:tcMar>
-          </w:tcPr>
-          <w:p>
-            <w:proofErr w:type="spellStart"/>
-            <w:proofErr w:type="gramStart"/>
-            <w:r>
-              <w:rPr>
-                <w:sz w:val="18"/>
-                <w:szCs w:val="18"/>
-              </w:rPr>
-              <w:t>EliminaPersonaggio</w:t>
-            </w:r>
-            <w:proofErr w:type="spellEnd"/>
-            <w:r>
-              <w:rPr>
-                <w:sz w:val="18"/>
-                <w:szCs w:val="18"/>
-              </w:rPr>
-              <w:t>(</w:t>
-            </w:r>
-            <w:proofErr w:type="gramEnd"/>
-            <w:r>
-              <w:rPr>
-                <w:sz w:val="18"/>
-                <w:szCs w:val="18"/>
-              </w:rPr>
-              <w:t>): confronto indici invece di nomi — nessun personaggio viene eliminato correttamente</w:t>
-            </w:r>
-          </w:p>
-        </w:tc>
-      </w:tr>
-      <w:tr>
-        <w:tblPrEx>
-          <w:tblCellMar>
-            <w:top w:w="0" w:type="dxa"/>
-            <w:bottom w:w="0" w:type="dxa"/>
-          </w:tblCellMar>
-        </w:tblPrEx>
-        <w:tc>
-          <w:tcPr>
-            <w:tcW w:w="2400" w:type="dxa"/>
-            <w:tcBorders>
-              <w:top w:val="single" w:sz="1" w:space="0" w:color="CCCCCC"/>
-              <w:left w:val="single" w:sz="1" w:space="0" w:color="CCCCCC"/>
-              <w:bottom w:val="single" w:sz="1" w:space="0" w:color="CCCCCC"/>
-              <w:right w:val="single" w:sz="1" w:space="0" w:color="CCCCCC"/>
-            </w:tcBorders>
-            <w:shd w:val="clear" w:color="auto" w:fill="FFFFFF"/>
-            <w:tcMar>
-              <w:top w:w="80" w:type="dxa"/>
-              <w:left w:w="140" w:type="dxa"/>
-              <w:bottom w:w="80" w:type="dxa"/>
-              <w:right w:w="140" w:type="dxa"/>
-            </w:tcMar>
-          </w:tcPr>
-          <w:p>
-            <w:r>
-              <w:rPr>
-                <w:sz w:val="18"/>
-                <w:szCs w:val="18"/>
-              </w:rPr>
-              <w:t>Giocatore.java</w:t>
-            </w:r>
-          </w:p>
-        </w:tc>
-        <w:tc>
-          <w:tcPr>
-            <w:tcW w:w="1800" w:type="dxa"/>
-            <w:tcBorders>
-              <w:top w:val="single" w:sz="1" w:space="0" w:color="CCCCCC"/>
-              <w:left w:val="single" w:sz="1" w:space="0" w:color="CCCCCC"/>
-              <w:bottom w:val="single" w:sz="1" w:space="0" w:color="CCCCCC"/>
-              <w:right w:val="single" w:sz="1" w:space="0" w:color="CCCCCC"/>
-            </w:tcBorders>
-            <w:shd w:val="clear" w:color="auto" w:fill="FFFFFF"/>
-            <w:tcMar>
-              <w:top w:w="80" w:type="dxa"/>
-              <w:left w:w="140" w:type="dxa"/>
-              <w:bottom w:w="80" w:type="dxa"/>
-              <w:right w:w="140" w:type="dxa"/>
-            </w:tcMar>
-          </w:tcPr>
-          <w:p>
-            <w:r>
-              <w:rPr>
-                <w:sz w:val="18"/>
-                <w:szCs w:val="18"/>
-              </w:rPr>
-              <w:t>Alto</w:t>
-            </w:r>
-          </w:p>
-        </w:tc>
-        <w:tc>
-          <w:tcPr>
-            <w:tcW w:w="5160" w:type="dxa"/>
-            <w:tcBorders>
-              <w:top w:val="single" w:sz="1" w:space="0" w:color="CCCCCC"/>
-              <w:left w:val="single" w:sz="1" w:space="0" w:color="CCCCCC"/>
-              <w:bottom w:val="single" w:sz="1" w:space="0" w:color="CCCCCC"/>
-              <w:right w:val="single" w:sz="1" w:space="0" w:color="CCCCCC"/>
-            </w:tcBorders>
-            <w:shd w:val="clear" w:color="auto" w:fill="FFFFFF"/>
-            <w:tcMar>
-              <w:top w:w="80" w:type="dxa"/>
-              <w:left w:w="140" w:type="dxa"/>
-              <w:bottom w:w="80" w:type="dxa"/>
-              <w:right w:w="140" w:type="dxa"/>
-            </w:tcMar>
-          </w:tcPr>
-          <w:p>
-            <w:r>
-              <w:rPr>
-                <w:sz w:val="18"/>
-                <w:szCs w:val="18"/>
-              </w:rPr>
-              <w:t xml:space="preserve">Confronto risposta == </w:t>
-            </w:r>
-            <w:proofErr w:type="gramStart"/>
-            <w:r>
-              <w:rPr>
-                <w:sz w:val="18"/>
-                <w:szCs w:val="18"/>
-              </w:rPr>
-              <w:t>"si"</w:t>
-            </w:r>
-            <w:proofErr w:type="gramEnd"/>
-            <w:r>
-              <w:rPr>
-                <w:sz w:val="18"/>
-                <w:szCs w:val="18"/>
-              </w:rPr>
-              <w:t xml:space="preserve"> </w:t>
-            </w:r>
-            <w:proofErr w:type="gramStart"/>
-            <w:r>
-              <w:rPr>
-                <w:sz w:val="18"/>
-                <w:szCs w:val="18"/>
-              </w:rPr>
-              <w:t>anziché .</w:t>
-            </w:r>
-            <w:proofErr w:type="spellStart"/>
-            <w:r>
-              <w:rPr>
-                <w:sz w:val="18"/>
-                <w:szCs w:val="18"/>
-              </w:rPr>
-              <w:t>equals</w:t>
-            </w:r>
-            <w:proofErr w:type="spellEnd"/>
-            <w:proofErr w:type="gramEnd"/>
-            <w:r>
-              <w:rPr>
-                <w:sz w:val="18"/>
-                <w:szCs w:val="18"/>
-              </w:rPr>
-              <w:t>("si")</w:t>
-            </w:r>
-          </w:p>
-        </w:tc>
-      </w:tr>
-      <w:tr>
-        <w:tblPrEx>
-          <w:tblCellMar>
-            <w:top w:w="0" w:type="dxa"/>
-            <w:bottom w:w="0" w:type="dxa"/>
-          </w:tblCellMar>
-        </w:tblPrEx>
-        <w:tc>
-          <w:tcPr>
-            <w:tcW w:w="2400" w:type="dxa"/>
-            <w:tcBorders>
-              <w:top w:val="single" w:sz="1" w:space="0" w:color="CCCCCC"/>
-              <w:left w:val="single" w:sz="1" w:space="0" w:color="CCCCCC"/>
-              <w:bottom w:val="single" w:sz="1" w:space="0" w:color="CCCCCC"/>
-              <w:right w:val="single" w:sz="1" w:space="0" w:color="CCCCCC"/>
-            </w:tcBorders>
-            <w:shd w:val="clear" w:color="auto" w:fill="EAF2FB"/>
-            <w:tcMar>
-              <w:top w:w="80" w:type="dxa"/>
-              <w:left w:w="140" w:type="dxa"/>
-              <w:bottom w:w="80" w:type="dxa"/>
-              <w:right w:w="140" w:type="dxa"/>
-            </w:tcMar>
-          </w:tcPr>
-          <w:p>
-            <w:r>
-              <w:rPr>
-                <w:sz w:val="18"/>
-                <w:szCs w:val="18"/>
-              </w:rPr>
-              <w:t>Personaggio.java</w:t>
-            </w:r>
-          </w:p>
-        </w:tc>
-        <w:tc>
-          <w:tcPr>
-            <w:tcW w:w="1800" w:type="dxa"/>
-            <w:tcBorders>
-              <w:top w:val="single" w:sz="1" w:space="0" w:color="CCCCCC"/>
-              <w:left w:val="single" w:sz="1" w:space="0" w:color="CCCCCC"/>
-              <w:bottom w:val="single" w:sz="1" w:space="0" w:color="CCCCCC"/>
-              <w:right w:val="single" w:sz="1" w:space="0" w:color="CCCCCC"/>
-            </w:tcBorders>
-            <w:shd w:val="clear" w:color="auto" w:fill="EAF2FB"/>
-            <w:tcMar>
-              <w:top w:w="80" w:type="dxa"/>
-              <w:left w:w="140" w:type="dxa"/>
-              <w:bottom w:w="80" w:type="dxa"/>
-              <w:right w:w="140" w:type="dxa"/>
-            </w:tcMar>
-          </w:tcPr>
-          <w:p>
-            <w:r>
-              <w:rPr>
-                <w:sz w:val="18"/>
-                <w:szCs w:val="18"/>
-              </w:rPr>
-              <w:t>Critico</w:t>
-            </w:r>
-          </w:p>
-        </w:tc>
-        <w:tc>
-          <w:tcPr>
-            <w:tcW w:w="5160" w:type="dxa"/>
-            <w:tcBorders>
-              <w:top w:val="single" w:sz="1" w:space="0" w:color="CCCCCC"/>
-              <w:left w:val="single" w:sz="1" w:space="0" w:color="CCCCCC"/>
-              <w:bottom w:val="single" w:sz="1" w:space="0" w:color="CCCCCC"/>
-              <w:right w:val="single" w:sz="1" w:space="0" w:color="CCCCCC"/>
-            </w:tcBorders>
-            <w:shd w:val="clear" w:color="auto" w:fill="EAF2FB"/>
-            <w:tcMar>
-              <w:top w:w="80" w:type="dxa"/>
-              <w:left w:w="140" w:type="dxa"/>
-              <w:bottom w:w="80" w:type="dxa"/>
-              <w:right w:w="140" w:type="dxa"/>
-            </w:tcMar>
-          </w:tcPr>
-          <w:p>
-            <w:r>
-              <w:rPr>
-                <w:sz w:val="18"/>
-                <w:szCs w:val="18"/>
-              </w:rPr>
-              <w:t xml:space="preserve">Non implementa </w:t>
-            </w:r>
-            <w:proofErr w:type="spellStart"/>
-            <w:r>
-              <w:rPr>
-                <w:sz w:val="18"/>
-                <w:szCs w:val="18"/>
-              </w:rPr>
-              <w:t>Serializable</w:t>
-            </w:r>
-            <w:proofErr w:type="spellEnd"/>
-            <w:r>
-              <w:rPr>
-                <w:sz w:val="18"/>
-                <w:szCs w:val="18"/>
-              </w:rPr>
-              <w:t xml:space="preserve">: la serializzazione dell'albero fallirà a </w:t>
-            </w:r>
-            <w:proofErr w:type="spellStart"/>
-            <w:r>
-              <w:rPr>
-                <w:sz w:val="18"/>
-                <w:szCs w:val="18"/>
-              </w:rPr>
-              <w:t>runtime</w:t>
-            </w:r>
-            <w:proofErr w:type="spellEnd"/>
-          </w:p>
-        </w:tc>
-      </w:tr>
-      <w:tr>
-        <w:tblPrEx>
-          <w:tblCellMar>
-            <w:top w:w="0" w:type="dxa"/>
-            <w:bottom w:w="0" w:type="dxa"/>
-          </w:tblCellMar>
-        </w:tblPrEx>
-        <w:tc>
-          <w:tcPr>
-            <w:tcW w:w="2400" w:type="dxa"/>
-            <w:tcBorders>
-              <w:top w:val="single" w:sz="1" w:space="0" w:color="CCCCCC"/>
-              <w:left w:val="single" w:sz="1" w:space="0" w:color="CCCCCC"/>
-              <w:bottom w:val="single" w:sz="1" w:space="0" w:color="CCCCCC"/>
-              <w:right w:val="single" w:sz="1" w:space="0" w:color="CCCCCC"/>
-            </w:tcBorders>
-            <w:shd w:val="clear" w:color="auto" w:fill="FFFFFF"/>
-            <w:tcMar>
-              <w:top w:w="80" w:type="dxa"/>
-              <w:left w:w="140" w:type="dxa"/>
-              <w:bottom w:w="80" w:type="dxa"/>
-              <w:right w:w="140" w:type="dxa"/>
-            </w:tcMar>
-          </w:tcPr>
-          <w:p>
-            <w:r>
-              <w:rPr>
-                <w:sz w:val="18"/>
-                <w:szCs w:val="18"/>
-              </w:rPr>
-              <w:t>GestoreFile.java</w:t>
-            </w:r>
-          </w:p>
-        </w:tc>
-        <w:tc>
-          <w:tcPr>
-            <w:tcW w:w="1800" w:type="dxa"/>
-            <w:tcBorders>
-              <w:top w:val="single" w:sz="1" w:space="0" w:color="CCCCCC"/>
-              <w:left w:val="single" w:sz="1" w:space="0" w:color="CCCCCC"/>
-              <w:bottom w:val="single" w:sz="1" w:space="0" w:color="CCCCCC"/>
-              <w:right w:val="single" w:sz="1" w:space="0" w:color="CCCCCC"/>
-            </w:tcBorders>
-            <w:shd w:val="clear" w:color="auto" w:fill="FFFFFF"/>
-            <w:tcMar>
-              <w:top w:w="80" w:type="dxa"/>
-              <w:left w:w="140" w:type="dxa"/>
-              <w:bottom w:w="80" w:type="dxa"/>
-              <w:right w:w="140" w:type="dxa"/>
-            </w:tcMar>
-          </w:tcPr>
-          <w:p>
-            <w:r>
-              <w:rPr>
-                <w:sz w:val="18"/>
-                <w:szCs w:val="18"/>
-              </w:rPr>
-              <w:t>Minore</w:t>
-            </w:r>
-          </w:p>
-        </w:tc>
-        <w:tc>
-          <w:tcPr>
-            <w:tcW w:w="5160" w:type="dxa"/>
-            <w:tcBorders>
-              <w:top w:val="single" w:sz="1" w:space="0" w:color="CCCCCC"/>
-              <w:left w:val="single" w:sz="1" w:space="0" w:color="CCCCCC"/>
-              <w:bottom w:val="single" w:sz="1" w:space="0" w:color="CCCCCC"/>
-              <w:right w:val="single" w:sz="1" w:space="0" w:color="CCCCCC"/>
-            </w:tcBorders>
-            <w:shd w:val="clear" w:color="auto" w:fill="FFFFFF"/>
-            <w:tcMar>
-              <w:top w:w="80" w:type="dxa"/>
-              <w:left w:w="140" w:type="dxa"/>
-              <w:bottom w:w="80" w:type="dxa"/>
-              <w:right w:w="140" w:type="dxa"/>
-            </w:tcMar>
-          </w:tcPr>
-          <w:p>
-            <w:r>
-              <w:rPr>
-                <w:sz w:val="18"/>
-                <w:szCs w:val="18"/>
-              </w:rPr>
-              <w:t xml:space="preserve">Stream duplicato e inutilizzato in </w:t>
-            </w:r>
-            <w:proofErr w:type="spellStart"/>
-            <w:r>
-              <w:rPr>
-                <w:sz w:val="18"/>
-                <w:szCs w:val="18"/>
-              </w:rPr>
-              <w:t>Scrivi_</w:t>
-            </w:r>
-            <w:proofErr w:type="gramStart"/>
-            <w:r>
-              <w:rPr>
-                <w:sz w:val="18"/>
-                <w:szCs w:val="18"/>
-              </w:rPr>
-              <w:t>binario</w:t>
-            </w:r>
-            <w:proofErr w:type="spellEnd"/>
-            <w:r>
-              <w:rPr>
-                <w:sz w:val="18"/>
-                <w:szCs w:val="18"/>
-              </w:rPr>
-              <w:t>(</w:t>
-            </w:r>
-            <w:proofErr w:type="gramEnd"/>
-            <w:r>
-              <w:rPr>
-                <w:sz w:val="18"/>
-                <w:szCs w:val="18"/>
-              </w:rPr>
-              <w:t>)</w:t>
-            </w:r>
-          </w:p>
-        </w:tc>
-      </w:tr>
-      <w:tr>
-        <w:tblPrEx>
-          <w:tblCellMar>
-            <w:top w:w="0" w:type="dxa"/>
-            <w:bottom w:w="0" w:type="dxa"/>
-          </w:tblCellMar>
-        </w:tblPrEx>
-        <w:tc>
-          <w:tcPr>
-            <w:tcW w:w="2400" w:type="dxa"/>
-            <w:tcBorders>
-              <w:top w:val="single" w:sz="1" w:space="0" w:color="CCCCCC"/>
-              <w:left w:val="single" w:sz="1" w:space="0" w:color="CCCCCC"/>
-              <w:bottom w:val="single" w:sz="1" w:space="0" w:color="CCCCCC"/>
-              <w:right w:val="single" w:sz="1" w:space="0" w:color="CCCCCC"/>
-            </w:tcBorders>
-            <w:shd w:val="clear" w:color="auto" w:fill="EAF2FB"/>
-            <w:tcMar>
-              <w:top w:w="80" w:type="dxa"/>
-              <w:left w:w="140" w:type="dxa"/>
-              <w:bottom w:w="80" w:type="dxa"/>
-              <w:right w:w="140" w:type="dxa"/>
-            </w:tcMar>
-          </w:tcPr>
-          <w:p>
-            <w:r>
-              <w:rPr>
-                <w:sz w:val="18"/>
-                <w:szCs w:val="18"/>
-              </w:rPr>
-              <w:t>GiocatoreUmano.java</w:t>
-            </w:r>
-          </w:p>
-        </w:tc>
-        <w:tc>
-          <w:tcPr>
-            <w:tcW w:w="1800" w:type="dxa"/>
-            <w:tcBorders>
-              <w:top w:val="single" w:sz="1" w:space="0" w:color="CCCCCC"/>
-              <w:left w:val="single" w:sz="1" w:space="0" w:color="CCCCCC"/>
-              <w:bottom w:val="single" w:sz="1" w:space="0" w:color="CCCCCC"/>
-              <w:right w:val="single" w:sz="1" w:space="0" w:color="CCCCCC"/>
-            </w:tcBorders>
-            <w:shd w:val="clear" w:color="auto" w:fill="EAF2FB"/>
-            <w:tcMar>
-              <w:top w:w="80" w:type="dxa"/>
-              <w:left w:w="140" w:type="dxa"/>
-              <w:bottom w:w="80" w:type="dxa"/>
-              <w:right w:w="140" w:type="dxa"/>
-            </w:tcMar>
-          </w:tcPr>
-          <w:p>
-            <w:r>
-              <w:rPr>
-                <w:sz w:val="18"/>
-                <w:szCs w:val="18"/>
-              </w:rPr>
-              <w:t>Incompleto</w:t>
-            </w:r>
-          </w:p>
-        </w:tc>
-        <w:tc>
-          <w:tcPr>
-            <w:tcW w:w="5160" w:type="dxa"/>
-            <w:tcBorders>
-              <w:top w:val="single" w:sz="1" w:space="0" w:color="CCCCCC"/>
-              <w:left w:val="single" w:sz="1" w:space="0" w:color="CCCCCC"/>
-              <w:bottom w:val="single" w:sz="1" w:space="0" w:color="CCCCCC"/>
-              <w:right w:val="single" w:sz="1" w:space="0" w:color="CCCCCC"/>
-            </w:tcBorders>
-            <w:shd w:val="clear" w:color="auto" w:fill="EAF2FB"/>
-            <w:tcMar>
-              <w:top w:w="80" w:type="dxa"/>
-              <w:left w:w="140" w:type="dxa"/>
-              <w:bottom w:w="80" w:type="dxa"/>
-              <w:right w:w="140" w:type="dxa"/>
-            </w:tcMar>
-          </w:tcPr>
-          <w:p>
-            <w:proofErr w:type="spellStart"/>
-            <w:proofErr w:type="gramStart"/>
-            <w:r>
-              <w:rPr>
-                <w:sz w:val="18"/>
-                <w:szCs w:val="18"/>
-              </w:rPr>
-              <w:t>ChiediDomanda</w:t>
-            </w:r>
-            <w:proofErr w:type="spellEnd"/>
-            <w:r>
-              <w:rPr>
-                <w:sz w:val="18"/>
-                <w:szCs w:val="18"/>
-              </w:rPr>
-              <w:t>(</w:t>
-            </w:r>
-            <w:proofErr w:type="gramEnd"/>
-            <w:r>
-              <w:rPr>
-                <w:sz w:val="18"/>
-                <w:szCs w:val="18"/>
-              </w:rPr>
-              <w:t>) senza corpo: errore di compilazione</w:t>
-            </w:r>
-          </w:p>
-        </w:tc>
-      </w:tr>
-      <w:tr>
-        <w:tblPrEx>
-          <w:tblCellMar>
-            <w:top w:w="0" w:type="dxa"/>
-            <w:bottom w:w="0" w:type="dxa"/>
-          </w:tblCellMar>
-        </w:tblPrEx>
-        <w:tc>
-          <w:tcPr>
-            <w:tcW w:w="2400" w:type="dxa"/>
-            <w:tcBorders>
-              <w:top w:val="single" w:sz="1" w:space="0" w:color="CCCCCC"/>
-              <w:left w:val="single" w:sz="1" w:space="0" w:color="CCCCCC"/>
-              <w:bottom w:val="single" w:sz="1" w:space="0" w:color="CCCCCC"/>
-              <w:right w:val="single" w:sz="1" w:space="0" w:color="CCCCCC"/>
-            </w:tcBorders>
-            <w:shd w:val="clear" w:color="auto" w:fill="FFFFFF"/>
-            <w:tcMar>
-              <w:top w:w="80" w:type="dxa"/>
-              <w:left w:w="140" w:type="dxa"/>
-              <w:bottom w:w="80" w:type="dxa"/>
-              <w:right w:w="140" w:type="dxa"/>
-            </w:tcMar>
-          </w:tcPr>
-          <w:p>
-            <w:r>
-              <w:rPr>
-                <w:sz w:val="18"/>
-                <w:szCs w:val="18"/>
-              </w:rPr>
-              <w:t>GiocatoreBot.java</w:t>
-            </w:r>
-          </w:p>
-        </w:tc>
-        <w:tc>
-          <w:tcPr>
-            <w:tcW w:w="1800" w:type="dxa"/>
-            <w:tcBorders>
-              <w:top w:val="single" w:sz="1" w:space="0" w:color="CCCCCC"/>
-              <w:left w:val="single" w:sz="1" w:space="0" w:color="CCCCCC"/>
-              <w:bottom w:val="single" w:sz="1" w:space="0" w:color="CCCCCC"/>
-              <w:right w:val="single" w:sz="1" w:space="0" w:color="CCCCCC"/>
-            </w:tcBorders>
-            <w:shd w:val="clear" w:color="auto" w:fill="FFFFFF"/>
-            <w:tcMar>
-              <w:top w:w="80" w:type="dxa"/>
-              <w:left w:w="140" w:type="dxa"/>
-              <w:bottom w:w="80" w:type="dxa"/>
-              <w:right w:w="140" w:type="dxa"/>
-            </w:tcMar>
-          </w:tcPr>
-          <w:p>
-            <w:r>
-              <w:rPr>
-                <w:sz w:val="18"/>
-                <w:szCs w:val="18"/>
-              </w:rPr>
-              <w:t>Incompleto</w:t>
-            </w:r>
-          </w:p>
-        </w:tc>
-        <w:tc>
-          <w:tcPr>
-            <w:tcW w:w="5160" w:type="dxa"/>
-            <w:tcBorders>
-              <w:top w:val="single" w:sz="1" w:space="0" w:color="CCCCCC"/>
-              <w:left w:val="single" w:sz="1" w:space="0" w:color="CCCCCC"/>
-              <w:bottom w:val="single" w:sz="1" w:space="0" w:color="CCCCCC"/>
-              <w:right w:val="single" w:sz="1" w:space="0" w:color="CCCCCC"/>
-            </w:tcBorders>
-            <w:shd w:val="clear" w:color="auto" w:fill="FFFFFF"/>
-            <w:tcMar>
-              <w:top w:w="80" w:type="dxa"/>
-              <w:left w:w="140" w:type="dxa"/>
-              <w:bottom w:w="80" w:type="dxa"/>
-              <w:right w:w="140" w:type="dxa"/>
-            </w:tcMar>
-          </w:tcPr>
-          <w:p>
-            <w:proofErr w:type="spellStart"/>
-            <w:proofErr w:type="gramStart"/>
-            <w:r>
-              <w:rPr>
-                <w:sz w:val="18"/>
-                <w:szCs w:val="18"/>
-              </w:rPr>
-              <w:t>ChiediDomanda</w:t>
-            </w:r>
-            <w:proofErr w:type="spellEnd"/>
-            <w:r>
-              <w:rPr>
-                <w:sz w:val="18"/>
-                <w:szCs w:val="18"/>
-              </w:rPr>
-              <w:t>(</w:t>
-            </w:r>
-            <w:proofErr w:type="gramEnd"/>
-            <w:r>
-              <w:rPr>
-                <w:sz w:val="18"/>
-                <w:szCs w:val="18"/>
-              </w:rPr>
-              <w:t>) restituisce stringa vuota, nessuna logica</w:t>
-            </w:r>
-          </w:p>
-        </w:tc>
-      </w:tr>
-      <w:tr>
-        <w:tblPrEx>
-          <w:tblCellMar>
-            <w:top w:w="0" w:type="dxa"/>
-            <w:bottom w:w="0" w:type="dxa"/>
-          </w:tblCellMar>
-        </w:tblPrEx>
-        <w:tc>
-          <w:tcPr>
-            <w:tcW w:w="2400" w:type="dxa"/>
-            <w:tcBorders>
-              <w:top w:val="single" w:sz="1" w:space="0" w:color="CCCCCC"/>
-              <w:left w:val="single" w:sz="1" w:space="0" w:color="CCCCCC"/>
-              <w:bottom w:val="single" w:sz="1" w:space="0" w:color="CCCCCC"/>
-              <w:right w:val="single" w:sz="1" w:space="0" w:color="CCCCCC"/>
-            </w:tcBorders>
-            <w:shd w:val="clear" w:color="auto" w:fill="EAF2FB"/>
-            <w:tcMar>
-              <w:top w:w="80" w:type="dxa"/>
-              <w:left w:w="140" w:type="dxa"/>
-              <w:bottom w:w="80" w:type="dxa"/>
-              <w:right w:w="140" w:type="dxa"/>
-            </w:tcMar>
-          </w:tcPr>
-          <w:p>
-            <w:r>
-              <w:rPr>
-                <w:sz w:val="18"/>
-                <w:szCs w:val="18"/>
-              </w:rPr>
-              <w:t>Main.java</w:t>
-            </w:r>
-          </w:p>
-        </w:tc>
-        <w:tc>
-          <w:tcPr>
-            <w:tcW w:w="1800" w:type="dxa"/>
-            <w:tcBorders>
-              <w:top w:val="single" w:sz="1" w:space="0" w:color="CCCCCC"/>
-              <w:left w:val="single" w:sz="1" w:space="0" w:color="CCCCCC"/>
-              <w:bottom w:val="single" w:sz="1" w:space="0" w:color="CCCCCC"/>
-              <w:right w:val="single" w:sz="1" w:space="0" w:color="CCCCCC"/>
-            </w:tcBorders>
-            <w:shd w:val="clear" w:color="auto" w:fill="EAF2FB"/>
-            <w:tcMar>
-              <w:top w:w="80" w:type="dxa"/>
-              <w:left w:w="140" w:type="dxa"/>
-              <w:bottom w:w="80" w:type="dxa"/>
-              <w:right w:w="140" w:type="dxa"/>
-            </w:tcMar>
-          </w:tcPr>
-          <w:p>
-            <w:r>
-              <w:rPr>
-                <w:sz w:val="18"/>
-                <w:szCs w:val="18"/>
-              </w:rPr>
-              <w:t>Incompleto</w:t>
-            </w:r>
-          </w:p>
-        </w:tc>
-        <w:tc>
-          <w:tcPr>
-            <w:tcW w:w="5160" w:type="dxa"/>
-            <w:tcBorders>
-              <w:top w:val="single" w:sz="1" w:space="0" w:color="CCCCCC"/>
-              <w:left w:val="single" w:sz="1" w:space="0" w:color="CCCCCC"/>
-              <w:bottom w:val="single" w:sz="1" w:space="0" w:color="CCCCCC"/>
-              <w:right w:val="single" w:sz="1" w:space="0" w:color="CCCCCC"/>
-            </w:tcBorders>
-            <w:shd w:val="clear" w:color="auto" w:fill="EAF2FB"/>
-            <w:tcMar>
-              <w:top w:w="80" w:type="dxa"/>
-              <w:left w:w="140" w:type="dxa"/>
-              <w:bottom w:w="80" w:type="dxa"/>
-              <w:right w:w="140" w:type="dxa"/>
-            </w:tcMar>
-          </w:tcPr>
-          <w:p>
-            <w:pPr>
-              <w:rPr>
-                <w:lang w:val="en-US"/>
-              </w:rPr>
-            </w:pPr>
-            <w:r>
-              <w:rPr>
-                <w:sz w:val="18"/>
-                <w:szCs w:val="18"/>
-                <w:lang w:val="en-US"/>
-              </w:rPr>
-              <w:t>Entry point non implementato (placeholder IntelliJ)</w:t>
-            </w:r>
-          </w:p>
-        </w:tc>
-      </w:tr>
-      <w:tr>
-        <w:tblPrEx>
-          <w:tblCellMar>
-            <w:top w:w="0" w:type="dxa"/>
-            <w:bottom w:w="0" w:type="dxa"/>
-          </w:tblCellMar>
-        </w:tblPrEx>
-        <w:tc>
-          <w:tcPr>
-            <w:tcW w:w="2400" w:type="dxa"/>
-            <w:tcBorders>
-              <w:top w:val="single" w:sz="1" w:space="0" w:color="CCCCCC"/>
-              <w:left w:val="single" w:sz="1" w:space="0" w:color="CCCCCC"/>
-              <w:bottom w:val="single" w:sz="1" w:space="0" w:color="CCCCCC"/>
-              <w:right w:val="single" w:sz="1" w:space="0" w:color="CCCCCC"/>
-            </w:tcBorders>
-            <w:shd w:val="clear" w:color="auto" w:fill="FFFFFF"/>
-            <w:tcMar>
-              <w:top w:w="80" w:type="dxa"/>
-              <w:left w:w="140" w:type="dxa"/>
-              <w:bottom w:w="80" w:type="dxa"/>
-              <w:right w:w="140" w:type="dxa"/>
-            </w:tcMar>
-          </w:tcPr>
-          <w:p>
-            <w:r>
-              <w:rPr>
-                <w:sz w:val="18"/>
-                <w:szCs w:val="18"/>
-              </w:rPr>
-              <w:lastRenderedPageBreak/>
               <w:t>Nodo.java</w:t>
             </w:r>
           </w:p>
@@ -8908,51 +7445,11 @@
     </w:p>
     <w:p>
       <w:pPr>
-        <w:spacing w:after="80"/>
+        <w:spacing w:after="120"/>
+        <w:rPr>
+          <w:u w:val="single"/>
+        </w:rPr>
       </w:pPr>
-    </w:p>
-    <w:p>
-      <w:pPr>
-        <w:pStyle w:val="Titolo1"/>
-        <w:pBdr>
-          <w:bottom w:val="single" w:sz="6" w:space="4" w:color="1F4E79"/>
-        </w:pBdr>
-      </w:pPr>
-      <w:r>
-        <w:t>6. Note Finali</w:t>
-      </w:r>
-    </w:p>
-    <w:p>
-      <w:pPr>
-        <w:spacing w:after="120"/>
-      </w:pPr>
-      <w:r>
-        <w:t>La documentazione è basata esclusivamente sull'analisi statica del codice sorgente fornito. Le parti segnalate come incomplete (</w:t>
-      </w:r>
-      <w:proofErr w:type="spellStart"/>
-      <w:r>
-        <w:t>GiocatoreUmano</w:t>
-      </w:r>
-      <w:proofErr w:type="spellEnd"/>
-      <w:r>
-        <w:t xml:space="preserve">, </w:t>
-      </w:r>
-      <w:proofErr w:type="spellStart"/>
-      <w:r>
-        <w:t>GiocatoreBot</w:t>
-      </w:r>
-      <w:proofErr w:type="spellEnd"/>
-      <w:r>
-        <w:t>, Main) dovranno essere documentate a integrazione ultimata.</w:t>
-      </w:r>
-    </w:p>
-    <w:p>
-      <w:pPr>
-        <w:spacing w:after="120"/>
-      </w:pPr>
-      <w:r>
-        <w:t>Si raccomanda di risolvere i bug critici in Albero.java, Personaggio.java e Giocatore.java prima di procedere con qualsiasi test funzionale, poiché compromettono il corretto funzionamento del flusso di gioco e della serializzazione.</w:t>
-      </w:r>
     </w:p>
     <w:sectPr>
       <w:pgSz w:w="11906" w:h="16838"/>

</xml_diff>